<commit_message>
Add column for DEs in iPSC
</commit_message>
<xml_diff>
--- a/iPSC gene modulation 3s.docx
+++ b/iPSC gene modulation 3s.docx
@@ -71,7 +71,6 @@
             <w:tcBorders>
               <w:top w:val="single" w:sz="16" w:space="0" w:color="D3D3D3"/>
               <w:bottom w:val="single" w:sz="16" w:space="0" w:color="D3D3D3"/>
-              <w:end w:val="single" w:space="0" w:color="D3D3D3"/>
             </w:tcBorders>
           </w:tcPr>
           <w:p>
@@ -87,6 +86,30 @@
                 <w:sz w:val="20"/>
               </w:rPr>
               <w:t xml:space="preserve">Genes Modulated</w:t>
+            </w:r>
+          </w:p>
+        </w:tc>
+        <w:tc>
+          <w:tcPr>
+            <w:tcBorders>
+              <w:top w:val="single" w:sz="16" w:space="0" w:color="D3D3D3"/>
+              <w:bottom w:val="single" w:sz="16" w:space="0" w:color="D3D3D3"/>
+              <w:end w:val="single" w:space="0" w:color="D3D3D3"/>
+            </w:tcBorders>
+          </w:tcPr>
+          <w:p>
+            <w:pPr>
+              <w:spacing w:before="0" w:after="60"/>
+              <w:keepNext/>
+              <w:jc w:val="center"/>
+            </w:pPr>
+            <w:r>
+              <w:rPr>
+                <w:b w:val="true"/>
+                <w:rFonts w:ascii="Calibri" w:hAnsi="Calibri"/>
+                <w:sz w:val="20"/>
+              </w:rPr>
+              <w:t xml:space="preserve">DEs in iPSC Dataset</w:t>
             </w:r>
           </w:p>
         </w:tc>
@@ -171,6 +194,31 @@
             </w:r>
           </w:p>
         </w:tc>
+        <w:tc>
+          <w:tcPr>
+            <w:tcBorders>
+              <w:top w:val="single" w:space="0" w:color="D3D3D3"/>
+              <w:bottom w:val="single" w:space="0" w:color="D3D3D3"/>
+              <w:start w:val="single" w:space="0" w:color="D3D3D3"/>
+              <w:end w:val="single" w:space="0" w:color="D3D3D3"/>
+            </w:tcBorders>
+            <w:shd w:val="clear" w:color="auto" w:fill="F2F2F2"/>
+          </w:tcPr>
+          <w:p>
+            <w:pPr>
+              <w:spacing w:before="0" w:after="60"/>
+              <w:keepNext/>
+              <w:jc w:val="center"/>
+            </w:pPr>
+            <w:r>
+              <w:rPr>
+                <w:rFonts w:ascii="Calibri" w:hAnsi="Calibri"/>
+                <w:sz w:val="20"/>
+              </w:rPr>
+              <w:t xml:space="preserve">↑ ACTA2, ↑ ITGB3, ↑ SLC30A8, ↑ CEBPD, ↑ CDK5R2, ↑ COL3A1, ↑ RBM24, ↑ NRN1, ↑ NPPB, ↑ RTP1</w:t>
+            </w:r>
+          </w:p>
+        </w:tc>
       </w:tr>
       <w:tr>
         <w:trPr>
@@ -250,6 +298,30 @@
             </w:r>
           </w:p>
         </w:tc>
+        <w:tc>
+          <w:tcPr>
+            <w:tcBorders>
+              <w:top w:val="single" w:space="0" w:color="D3D3D3"/>
+              <w:bottom w:val="single" w:space="0" w:color="D3D3D3"/>
+              <w:start w:val="single" w:space="0" w:color="D3D3D3"/>
+              <w:end w:val="single" w:space="0" w:color="D3D3D3"/>
+            </w:tcBorders>
+          </w:tcPr>
+          <w:p>
+            <w:pPr>
+              <w:spacing w:before="0" w:after="60"/>
+              <w:keepNext/>
+              <w:jc w:val="center"/>
+            </w:pPr>
+            <w:r>
+              <w:rPr>
+                <w:rFonts w:ascii="Calibri" w:hAnsi="Calibri"/>
+                <w:sz w:val="20"/>
+              </w:rPr>
+              <w:t xml:space="preserve">↑ ACTA2, ↑ INSL3, ↑ COL3A1, ↑ NPPB, ↑ NRN1, ↑ RTP1, ↑ SNAP25, ↑ ISL1</w:t>
+            </w:r>
+          </w:p>
+        </w:tc>
       </w:tr>
       <w:tr>
         <w:trPr>
@@ -331,6 +403,31 @@
             </w:r>
           </w:p>
         </w:tc>
+        <w:tc>
+          <w:tcPr>
+            <w:tcBorders>
+              <w:top w:val="single" w:space="0" w:color="D3D3D3"/>
+              <w:bottom w:val="single" w:space="0" w:color="D3D3D3"/>
+              <w:start w:val="single" w:space="0" w:color="D3D3D3"/>
+              <w:end w:val="single" w:space="0" w:color="D3D3D3"/>
+            </w:tcBorders>
+            <w:shd w:val="clear" w:color="auto" w:fill="F2F2F2"/>
+          </w:tcPr>
+          <w:p>
+            <w:pPr>
+              <w:spacing w:before="0" w:after="60"/>
+              <w:keepNext/>
+              <w:jc w:val="center"/>
+            </w:pPr>
+            <w:r>
+              <w:rPr>
+                <w:rFonts w:ascii="Calibri" w:hAnsi="Calibri"/>
+                <w:sz w:val="20"/>
+              </w:rPr>
+              <w:t xml:space="preserve">↑ CPA4</w:t>
+            </w:r>
+          </w:p>
+        </w:tc>
       </w:tr>
       <w:tr>
         <w:trPr>
@@ -410,6 +507,30 @@
             </w:r>
           </w:p>
         </w:tc>
+        <w:tc>
+          <w:tcPr>
+            <w:tcBorders>
+              <w:top w:val="single" w:space="0" w:color="D3D3D3"/>
+              <w:bottom w:val="single" w:space="0" w:color="D3D3D3"/>
+              <w:start w:val="single" w:space="0" w:color="D3D3D3"/>
+              <w:end w:val="single" w:space="0" w:color="D3D3D3"/>
+            </w:tcBorders>
+          </w:tcPr>
+          <w:p>
+            <w:pPr>
+              <w:spacing w:before="0" w:after="60"/>
+              <w:keepNext/>
+              <w:jc w:val="center"/>
+            </w:pPr>
+            <w:r>
+              <w:rPr>
+                <w:rFonts w:ascii="Calibri" w:hAnsi="Calibri"/>
+                <w:sz w:val="20"/>
+              </w:rPr>
+              <w:t xml:space="preserve">↑ INSL3</w:t>
+            </w:r>
+          </w:p>
+        </w:tc>
       </w:tr>
       <w:tr>
         <w:trPr>
@@ -491,6 +612,31 @@
             </w:r>
           </w:p>
         </w:tc>
+        <w:tc>
+          <w:tcPr>
+            <w:tcBorders>
+              <w:top w:val="single" w:space="0" w:color="D3D3D3"/>
+              <w:bottom w:val="single" w:space="0" w:color="D3D3D3"/>
+              <w:start w:val="single" w:space="0" w:color="D3D3D3"/>
+              <w:end w:val="single" w:space="0" w:color="D3D3D3"/>
+            </w:tcBorders>
+            <w:shd w:val="clear" w:color="auto" w:fill="F2F2F2"/>
+          </w:tcPr>
+          <w:p>
+            <w:pPr>
+              <w:spacing w:before="0" w:after="60"/>
+              <w:keepNext/>
+              <w:jc w:val="center"/>
+            </w:pPr>
+            <w:r>
+              <w:rPr>
+                <w:rFonts w:ascii="Calibri" w:hAnsi="Calibri"/>
+                <w:sz w:val="20"/>
+              </w:rPr>
+              <w:t xml:space="preserve">↑ INSL3</w:t>
+            </w:r>
+          </w:p>
+        </w:tc>
       </w:tr>
       <w:tr>
         <w:trPr>
@@ -570,6 +716,30 @@
             </w:r>
           </w:p>
         </w:tc>
+        <w:tc>
+          <w:tcPr>
+            <w:tcBorders>
+              <w:top w:val="single" w:space="0" w:color="D3D3D3"/>
+              <w:bottom w:val="single" w:space="0" w:color="D3D3D3"/>
+              <w:start w:val="single" w:space="0" w:color="D3D3D3"/>
+              <w:end w:val="single" w:space="0" w:color="D3D3D3"/>
+            </w:tcBorders>
+          </w:tcPr>
+          <w:p>
+            <w:pPr>
+              <w:spacing w:before="0" w:after="60"/>
+              <w:keepNext/>
+              <w:jc w:val="center"/>
+            </w:pPr>
+            <w:r>
+              <w:rPr>
+                <w:rFonts w:ascii="Calibri" w:hAnsi="Calibri"/>
+                <w:sz w:val="20"/>
+              </w:rPr>
+              <w:t xml:space="preserve">↑ NRN1, ↑ RTP1</w:t>
+            </w:r>
+          </w:p>
+        </w:tc>
       </w:tr>
       <w:tr>
         <w:trPr>
@@ -651,6 +821,31 @@
             </w:r>
           </w:p>
         </w:tc>
+        <w:tc>
+          <w:tcPr>
+            <w:tcBorders>
+              <w:top w:val="single" w:space="0" w:color="D3D3D3"/>
+              <w:bottom w:val="single" w:space="0" w:color="D3D3D3"/>
+              <w:start w:val="single" w:space="0" w:color="D3D3D3"/>
+              <w:end w:val="single" w:space="0" w:color="D3D3D3"/>
+            </w:tcBorders>
+            <w:shd w:val="clear" w:color="auto" w:fill="F2F2F2"/>
+          </w:tcPr>
+          <w:p>
+            <w:pPr>
+              <w:spacing w:before="0" w:after="60"/>
+              <w:keepNext/>
+              <w:jc w:val="center"/>
+            </w:pPr>
+            <w:r>
+              <w:rPr>
+                <w:rFonts w:ascii="Calibri" w:hAnsi="Calibri"/>
+                <w:sz w:val="20"/>
+              </w:rPr>
+              <w:t xml:space="preserve">↑ FZD10</w:t>
+            </w:r>
+          </w:p>
+        </w:tc>
       </w:tr>
       <w:tr>
         <w:trPr>
@@ -730,6 +925,30 @@
             </w:r>
           </w:p>
         </w:tc>
+        <w:tc>
+          <w:tcPr>
+            <w:tcBorders>
+              <w:top w:val="single" w:space="0" w:color="D3D3D3"/>
+              <w:bottom w:val="single" w:space="0" w:color="D3D3D3"/>
+              <w:start w:val="single" w:space="0" w:color="D3D3D3"/>
+              <w:end w:val="single" w:space="0" w:color="D3D3D3"/>
+            </w:tcBorders>
+          </w:tcPr>
+          <w:p>
+            <w:pPr>
+              <w:spacing w:before="0" w:after="60"/>
+              <w:keepNext/>
+              <w:jc w:val="center"/>
+            </w:pPr>
+            <w:r>
+              <w:rPr>
+                <w:rFonts w:ascii="Calibri" w:hAnsi="Calibri"/>
+                <w:sz w:val="20"/>
+              </w:rPr>
+              <w:t xml:space="preserve">↑ SNAP25</w:t>
+            </w:r>
+          </w:p>
+        </w:tc>
       </w:tr>
       <w:tr>
         <w:trPr>
@@ -811,6 +1030,31 @@
             </w:r>
           </w:p>
         </w:tc>
+        <w:tc>
+          <w:tcPr>
+            <w:tcBorders>
+              <w:top w:val="single" w:space="0" w:color="D3D3D3"/>
+              <w:bottom w:val="single" w:space="0" w:color="D3D3D3"/>
+              <w:start w:val="single" w:space="0" w:color="D3D3D3"/>
+              <w:end w:val="single" w:space="0" w:color="D3D3D3"/>
+            </w:tcBorders>
+            <w:shd w:val="clear" w:color="auto" w:fill="F2F2F2"/>
+          </w:tcPr>
+          <w:p>
+            <w:pPr>
+              <w:spacing w:before="0" w:after="60"/>
+              <w:keepNext/>
+              <w:jc w:val="center"/>
+            </w:pPr>
+            <w:r>
+              <w:rPr>
+                <w:rFonts w:ascii="Calibri" w:hAnsi="Calibri"/>
+                <w:sz w:val="20"/>
+              </w:rPr>
+              <w:t xml:space="preserve">↑ ITGA11, ↑ CEBPD, ↑ INSL3, ↑ CTSF, ↑ NPPB, ↑ NRN1, ↑ SNAP25</w:t>
+            </w:r>
+          </w:p>
+        </w:tc>
       </w:tr>
       <w:tr>
         <w:trPr>
@@ -890,6 +1134,30 @@
             </w:r>
           </w:p>
         </w:tc>
+        <w:tc>
+          <w:tcPr>
+            <w:tcBorders>
+              <w:top w:val="single" w:space="0" w:color="D3D3D3"/>
+              <w:bottom w:val="single" w:space="0" w:color="D3D3D3"/>
+              <w:start w:val="single" w:space="0" w:color="D3D3D3"/>
+              <w:end w:val="single" w:space="0" w:color="D3D3D3"/>
+            </w:tcBorders>
+          </w:tcPr>
+          <w:p>
+            <w:pPr>
+              <w:spacing w:before="0" w:after="60"/>
+              <w:keepNext/>
+              <w:jc w:val="center"/>
+            </w:pPr>
+            <w:r>
+              <w:rPr>
+                <w:rFonts w:ascii="Calibri" w:hAnsi="Calibri"/>
+                <w:sz w:val="20"/>
+              </w:rPr>
+              <w:t xml:space="preserve">↑ SNAP25, ↑ HTR1A</w:t>
+            </w:r>
+          </w:p>
+        </w:tc>
       </w:tr>
       <w:tr>
         <w:trPr>
@@ -971,6 +1239,31 @@
             </w:r>
           </w:p>
         </w:tc>
+        <w:tc>
+          <w:tcPr>
+            <w:tcBorders>
+              <w:top w:val="single" w:space="0" w:color="D3D3D3"/>
+              <w:bottom w:val="single" w:space="0" w:color="D3D3D3"/>
+              <w:start w:val="single" w:space="0" w:color="D3D3D3"/>
+              <w:end w:val="single" w:space="0" w:color="D3D3D3"/>
+            </w:tcBorders>
+            <w:shd w:val="clear" w:color="auto" w:fill="F2F2F2"/>
+          </w:tcPr>
+          <w:p>
+            <w:pPr>
+              <w:spacing w:before="0" w:after="60"/>
+              <w:keepNext/>
+              <w:jc w:val="center"/>
+            </w:pPr>
+            <w:r>
+              <w:rPr>
+                <w:rFonts w:ascii="Calibri" w:hAnsi="Calibri"/>
+                <w:sz w:val="20"/>
+              </w:rPr>
+              <w:t xml:space="preserve">↑ ACTA2, ↑ CEBPD, ↑ COL3A1, ↑ NRN1, ↑ SNAP25</w:t>
+            </w:r>
+          </w:p>
+        </w:tc>
       </w:tr>
       <w:tr>
         <w:trPr>
@@ -1050,6 +1343,30 @@
             </w:r>
           </w:p>
         </w:tc>
+        <w:tc>
+          <w:tcPr>
+            <w:tcBorders>
+              <w:top w:val="single" w:space="0" w:color="D3D3D3"/>
+              <w:bottom w:val="single" w:space="0" w:color="D3D3D3"/>
+              <w:start w:val="single" w:space="0" w:color="D3D3D3"/>
+              <w:end w:val="single" w:space="0" w:color="D3D3D3"/>
+            </w:tcBorders>
+          </w:tcPr>
+          <w:p>
+            <w:pPr>
+              <w:spacing w:before="0" w:after="60"/>
+              <w:keepNext/>
+              <w:jc w:val="center"/>
+            </w:pPr>
+            <w:r>
+              <w:rPr>
+                <w:rFonts w:ascii="Calibri" w:hAnsi="Calibri"/>
+                <w:sz w:val="20"/>
+              </w:rPr>
+              <w:t xml:space="preserve">↑ NRN1</w:t>
+            </w:r>
+          </w:p>
+        </w:tc>
       </w:tr>
       <w:tr>
         <w:trPr>
@@ -1131,6 +1448,31 @@
             </w:r>
           </w:p>
         </w:tc>
+        <w:tc>
+          <w:tcPr>
+            <w:tcBorders>
+              <w:top w:val="single" w:space="0" w:color="D3D3D3"/>
+              <w:bottom w:val="single" w:space="0" w:color="D3D3D3"/>
+              <w:start w:val="single" w:space="0" w:color="D3D3D3"/>
+              <w:end w:val="single" w:space="0" w:color="D3D3D3"/>
+            </w:tcBorders>
+            <w:shd w:val="clear" w:color="auto" w:fill="F2F2F2"/>
+          </w:tcPr>
+          <w:p>
+            <w:pPr>
+              <w:spacing w:before="0" w:after="60"/>
+              <w:keepNext/>
+              <w:jc w:val="center"/>
+            </w:pPr>
+            <w:r>
+              <w:rPr>
+                <w:rFonts w:ascii="Calibri" w:hAnsi="Calibri"/>
+                <w:sz w:val="20"/>
+              </w:rPr>
+              <w:t xml:space="preserve">↑ CTSF, ↑ SNAP25, ↑ HTR1A</w:t>
+            </w:r>
+          </w:p>
+        </w:tc>
       </w:tr>
       <w:tr>
         <w:trPr>
@@ -1210,6 +1552,30 @@
             </w:r>
           </w:p>
         </w:tc>
+        <w:tc>
+          <w:tcPr>
+            <w:tcBorders>
+              <w:top w:val="single" w:space="0" w:color="D3D3D3"/>
+              <w:bottom w:val="single" w:space="0" w:color="D3D3D3"/>
+              <w:start w:val="single" w:space="0" w:color="D3D3D3"/>
+              <w:end w:val="single" w:space="0" w:color="D3D3D3"/>
+            </w:tcBorders>
+          </w:tcPr>
+          <w:p>
+            <w:pPr>
+              <w:spacing w:before="0" w:after="60"/>
+              <w:keepNext/>
+              <w:jc w:val="center"/>
+            </w:pPr>
+            <w:r>
+              <w:rPr>
+                <w:rFonts w:ascii="Calibri" w:hAnsi="Calibri"/>
+                <w:sz w:val="20"/>
+              </w:rPr>
+              <w:t xml:space="preserve">↑ EBF1, ↑ LOXL4, ↑ ITGA11, ↑ INSL3, ↑ COL3A1, ↑ RBM24, ↑ ISL1, ↑ CPA4</w:t>
+            </w:r>
+          </w:p>
+        </w:tc>
       </w:tr>
       <w:tr>
         <w:trPr>
@@ -1291,6 +1657,31 @@
             </w:r>
           </w:p>
         </w:tc>
+        <w:tc>
+          <w:tcPr>
+            <w:tcBorders>
+              <w:top w:val="single" w:space="0" w:color="D3D3D3"/>
+              <w:bottom w:val="single" w:space="0" w:color="D3D3D3"/>
+              <w:start w:val="single" w:space="0" w:color="D3D3D3"/>
+              <w:end w:val="single" w:space="0" w:color="D3D3D3"/>
+            </w:tcBorders>
+            <w:shd w:val="clear" w:color="auto" w:fill="F2F2F2"/>
+          </w:tcPr>
+          <w:p>
+            <w:pPr>
+              <w:spacing w:before="0" w:after="60"/>
+              <w:keepNext/>
+              <w:jc w:val="center"/>
+            </w:pPr>
+            <w:r>
+              <w:rPr>
+                <w:rFonts w:ascii="Calibri" w:hAnsi="Calibri"/>
+                <w:sz w:val="20"/>
+              </w:rPr>
+              <w:t xml:space="preserve">↑ COL3A1, ↑ PHOX2B, ↑ CEBPD</w:t>
+            </w:r>
+          </w:p>
+        </w:tc>
       </w:tr>
       <w:tr>
         <w:trPr>
@@ -1370,6 +1761,30 @@
             </w:r>
           </w:p>
         </w:tc>
+        <w:tc>
+          <w:tcPr>
+            <w:tcBorders>
+              <w:top w:val="single" w:space="0" w:color="D3D3D3"/>
+              <w:bottom w:val="single" w:space="0" w:color="D3D3D3"/>
+              <w:start w:val="single" w:space="0" w:color="D3D3D3"/>
+              <w:end w:val="single" w:space="0" w:color="D3D3D3"/>
+            </w:tcBorders>
+          </w:tcPr>
+          <w:p>
+            <w:pPr>
+              <w:spacing w:before="0" w:after="60"/>
+              <w:keepNext/>
+              <w:jc w:val="center"/>
+            </w:pPr>
+            <w:r>
+              <w:rPr>
+                <w:rFonts w:ascii="Calibri" w:hAnsi="Calibri"/>
+                <w:sz w:val="20"/>
+              </w:rPr>
+              <w:t xml:space="preserve">↑ CEBPD</w:t>
+            </w:r>
+          </w:p>
+        </w:tc>
       </w:tr>
       <w:tr>
         <w:trPr>
@@ -1451,6 +1866,31 @@
             </w:r>
           </w:p>
         </w:tc>
+        <w:tc>
+          <w:tcPr>
+            <w:tcBorders>
+              <w:top w:val="single" w:space="0" w:color="D3D3D3"/>
+              <w:bottom w:val="single" w:space="0" w:color="D3D3D3"/>
+              <w:start w:val="single" w:space="0" w:color="D3D3D3"/>
+              <w:end w:val="single" w:space="0" w:color="D3D3D3"/>
+            </w:tcBorders>
+            <w:shd w:val="clear" w:color="auto" w:fill="F2F2F2"/>
+          </w:tcPr>
+          <w:p>
+            <w:pPr>
+              <w:spacing w:before="0" w:after="60"/>
+              <w:keepNext/>
+              <w:jc w:val="center"/>
+            </w:pPr>
+            <w:r>
+              <w:rPr>
+                <w:rFonts w:ascii="Calibri" w:hAnsi="Calibri"/>
+                <w:sz w:val="20"/>
+              </w:rPr>
+              <w:t xml:space="preserve">↑ ARRB1</w:t>
+            </w:r>
+          </w:p>
+        </w:tc>
       </w:tr>
       <w:tr>
         <w:trPr>
@@ -1530,6 +1970,30 @@
             </w:r>
           </w:p>
         </w:tc>
+        <w:tc>
+          <w:tcPr>
+            <w:tcBorders>
+              <w:top w:val="single" w:space="0" w:color="D3D3D3"/>
+              <w:bottom w:val="single" w:space="0" w:color="D3D3D3"/>
+              <w:start w:val="single" w:space="0" w:color="D3D3D3"/>
+              <w:end w:val="single" w:space="0" w:color="D3D3D3"/>
+            </w:tcBorders>
+          </w:tcPr>
+          <w:p>
+            <w:pPr>
+              <w:spacing w:before="0" w:after="60"/>
+              <w:keepNext/>
+              <w:jc w:val="center"/>
+            </w:pPr>
+            <w:r>
+              <w:rPr>
+                <w:rFonts w:ascii="Calibri" w:hAnsi="Calibri"/>
+                <w:sz w:val="20"/>
+              </w:rPr>
+              <w:t xml:space="preserve">↑ FZD10, ↑ NRN1, ↑ RTP1, ↑ CHL1, ↑ ARRB1</w:t>
+            </w:r>
+          </w:p>
+        </w:tc>
       </w:tr>
       <w:tr>
         <w:trPr>
@@ -1611,6 +2075,31 @@
             </w:r>
           </w:p>
         </w:tc>
+        <w:tc>
+          <w:tcPr>
+            <w:tcBorders>
+              <w:top w:val="single" w:space="0" w:color="D3D3D3"/>
+              <w:bottom w:val="single" w:space="0" w:color="D3D3D3"/>
+              <w:start w:val="single" w:space="0" w:color="D3D3D3"/>
+              <w:end w:val="single" w:space="0" w:color="D3D3D3"/>
+            </w:tcBorders>
+            <w:shd w:val="clear" w:color="auto" w:fill="F2F2F2"/>
+          </w:tcPr>
+          <w:p>
+            <w:pPr>
+              <w:spacing w:before="0" w:after="60"/>
+              <w:keepNext/>
+              <w:jc w:val="center"/>
+            </w:pPr>
+            <w:r>
+              <w:rPr>
+                <w:rFonts w:ascii="Calibri" w:hAnsi="Calibri"/>
+                <w:sz w:val="20"/>
+              </w:rPr>
+              <w:t xml:space="preserve">↑ SNAP25</w:t>
+            </w:r>
+          </w:p>
+        </w:tc>
       </w:tr>
       <w:tr>
         <w:trPr>
@@ -1690,6 +2179,30 @@
             </w:r>
           </w:p>
         </w:tc>
+        <w:tc>
+          <w:tcPr>
+            <w:tcBorders>
+              <w:top w:val="single" w:space="0" w:color="D3D3D3"/>
+              <w:bottom w:val="single" w:space="0" w:color="D3D3D3"/>
+              <w:start w:val="single" w:space="0" w:color="D3D3D3"/>
+              <w:end w:val="single" w:space="0" w:color="D3D3D3"/>
+            </w:tcBorders>
+          </w:tcPr>
+          <w:p>
+            <w:pPr>
+              <w:spacing w:before="0" w:after="60"/>
+              <w:keepNext/>
+              <w:jc w:val="center"/>
+            </w:pPr>
+            <w:r>
+              <w:rPr>
+                <w:rFonts w:ascii="Calibri" w:hAnsi="Calibri"/>
+                <w:sz w:val="20"/>
+              </w:rPr>
+              <w:t xml:space="preserve">↑ KCNC3, ↑ ISL1</w:t>
+            </w:r>
+          </w:p>
+        </w:tc>
       </w:tr>
       <w:tr>
         <w:trPr>
@@ -1768,6 +2281,31 @@
                 <w:sz w:val="20"/>
               </w:rPr>
               <w:t xml:space="preserve">↓ INSL3</w:t>
+            </w:r>
+          </w:p>
+        </w:tc>
+        <w:tc>
+          <w:tcPr>
+            <w:tcBorders>
+              <w:top w:val="single" w:space="0" w:color="D3D3D3"/>
+              <w:bottom w:val="single" w:space="0" w:color="D3D3D3"/>
+              <w:start w:val="single" w:space="0" w:color="D3D3D3"/>
+              <w:end w:val="single" w:space="0" w:color="D3D3D3"/>
+            </w:tcBorders>
+            <w:shd w:val="clear" w:color="auto" w:fill="F2F2F2"/>
+          </w:tcPr>
+          <w:p>
+            <w:pPr>
+              <w:spacing w:before="0" w:after="60"/>
+              <w:keepNext/>
+              <w:jc w:val="center"/>
+            </w:pPr>
+            <w:r>
+              <w:rPr>
+                <w:rFonts w:ascii="Calibri" w:hAnsi="Calibri"/>
+                <w:sz w:val="20"/>
+              </w:rPr>
+              <w:t xml:space="preserve">↑ INSL3</w:t>
             </w:r>
           </w:p>
         </w:tc>

</xml_diff>

<commit_message>
Generate pictures on MacOS
</commit_message>
<xml_diff>
--- a/iPSC gene modulation 3s.docx
+++ b/iPSC gene modulation 3s.docx
@@ -2437,10 +2437,10 @@
   <w:docDefaults>
     <w:rPrDefault>
       <w:rPr>
-        <w:rFonts w:asciiTheme="minorHAnsi" w:cstheme="minorBidi" w:eastAsiaTheme="minorEastAsia" w:hAnsiTheme="minorHAnsi"/>
+        <w:rFonts w:asciiTheme="minorHAnsi" w:cstheme="minorBidi" w:eastAsiaTheme="minorHAnsi" w:hAnsiTheme="minorHAnsi"/>
         <w:sz w:val="24"/>
         <w:szCs w:val="24"/>
-        <w:lang w:bidi="ar-SA" w:eastAsia="zh-CN" w:val="en-US"/>
+        <w:lang w:bidi="ar-SA" w:eastAsia="en-US" w:val="en-US"/>
       </w:rPr>
     </w:rPrDefault>
     <w:pPrDefault>
@@ -2981,6 +2981,13 @@
       </w:tblCellMar>
     </w:tblPr>
     <w:tblStylePr w:type="firstRow">
+      <w:tblPr>
+        <w:jc w:val="left"/>
+        <w:tblInd w:type="dxa" w:w="0"/>
+      </w:tblPr>
+      <w:trPr>
+        <w:jc w:val="left"/>
+      </w:trPr>
       <w:tcPr>
         <w:tcBorders>
           <w:bottom w:val="single"/>

</xml_diff>